<commit_message>
docs: smernice obchodni etiky - cisty styl s logem misto hlavicek/paticek (CZ+DE prepracovano, ENG nove) + logo asset eurosoft_logo_plain.png
</commit_message>
<xml_diff>
--- a/docs/Richtlinie_Geschaeftsethik_EUROSOFT.docx
+++ b/docs/Richtlinie_Geschaeftsethik_EUROSOFT.docx
@@ -4,18 +4,48 @@
   <w:body>
     <w:p>
       <w:pPr>
-        <w:spacing w:after="40"/>
-        <w:jc w:val="center"/>
-      </w:pPr>
-      <w:r>
-        <w:rPr>
-          <w:b/>
-          <w:bCs/>
-          <w:color w:val="1F4E79"/>
-          <w:sz w:val="30"/>
-          <w:szCs w:val="30"/>
-        </w:rPr>
-        <w:t xml:space="preserve">EUROSOFT</w:t>
+        <w:spacing w:after="220"/>
+        <w:jc w:val="left"/>
+      </w:pPr>
+      <w:r>
+        <w:drawing>
+          <wp:inline distT="0" distB="0" distL="0" distR="0">
+            <wp:extent cx="2190750" cy="342900"/>
+            <wp:effectExtent t="0" r="0" b="0" l="0"/>
+            <wp:docPr id="1" name="EUROSOFT logo" descr="Logo EUROSOFT" title="EUROSOFT"/>
+            <wp:cNvGraphicFramePr>
+              <a:graphicFrameLocks xmlns:a="http://schemas.openxmlformats.org/drawingml/2006/main" noChangeAspect="1"/>
+            </wp:cNvGraphicFramePr>
+            <a:graphic xmlns:a="http://schemas.openxmlformats.org/drawingml/2006/main">
+              <a:graphicData uri="http://schemas.openxmlformats.org/drawingml/2006/picture">
+                <pic:pic xmlns:pic="http://schemas.openxmlformats.org/drawingml/2006/picture">
+                  <pic:nvPicPr>
+                    <pic:cNvPr id="0" name="" descr=""/>
+                    <pic:cNvPicPr>
+                      <a:picLocks noChangeAspect="1" noChangeArrowheads="1"/>
+                    </pic:cNvPicPr>
+                  </pic:nvPicPr>
+                  <pic:blipFill>
+                    <a:blip r:embed="rId7" cstate="none"/>
+                    <a:srcRect/>
+                    <a:stretch>
+                      <a:fillRect/>
+                    </a:stretch>
+                  </pic:blipFill>
+                  <pic:spPr bwMode="auto">
+                    <a:xfrm>
+                      <a:off x="0" y="0"/>
+                      <a:ext cx="2190750" cy="342900"/>
+                    </a:xfrm>
+                    <a:prstGeom prst="rect">
+                      <a:avLst/>
+                    </a:prstGeom>
+                  </pic:spPr>
+                </pic:pic>
+              </a:graphicData>
+            </a:graphic>
+          </wp:inline>
+        </w:drawing>
       </w:r>
     </w:p>
     <w:p>
@@ -815,7 +845,6 @@
       </w:r>
     </w:p>
     <w:sectPr>
-      <w:footerReference w:type="default" r:id="rId7"/>
       <w:pgSz w:w="11906" w:h="16838" w:orient="portrait"/>
       <w:pgMar w:top="1300" w:right="1300" w:bottom="1300" w:left="1300" w:header="708" w:footer="708" w:gutter="0"/>
       <w:pgNumType/>
@@ -864,35 +893,6 @@
     </w:p>
   </w:endnote>
 </w:endnotes>
-</file>
-
-<file path=word/footer1.xml><?xml version="1.0" encoding="utf-8"?>
-<w:ftr xmlns:wpc="http://schemas.microsoft.com/office/word/2010/wordprocessingCanvas" xmlns:mc="http://schemas.openxmlformats.org/markup-compatibility/2006" xmlns:o="urn:schemas-microsoft-com:office:office" xmlns:r="http://schemas.openxmlformats.org/officeDocument/2006/relationships" xmlns:m="http://schemas.openxmlformats.org/officeDocument/2006/math" xmlns:v="urn:schemas-microsoft-com:vml" xmlns:wp14="http://schemas.microsoft.com/office/word/2010/wordprocessingDrawing" xmlns:wp="http://schemas.openxmlformats.org/drawingml/2006/wordprocessingDrawing" xmlns:w10="urn:schemas-microsoft-com:office:word" xmlns:w="http://schemas.openxmlformats.org/wordprocessingml/2006/main" xmlns:w14="http://schemas.microsoft.com/office/word/2010/wordml" xmlns:w15="http://schemas.microsoft.com/office/word/2012/wordml" xmlns:wpg="http://schemas.microsoft.com/office/word/2010/wordprocessingGroup" xmlns:wpi="http://schemas.microsoft.com/office/word/2010/wordprocessingInk" xmlns:wne="http://schemas.microsoft.com/office/word/2006/wordml" xmlns:wps="http://schemas.microsoft.com/office/word/2010/wordprocessingShape">
-  <w:p>
-    <w:pPr>
-      <w:jc w:val="center"/>
-    </w:pPr>
-    <w:r>
-      <w:rPr>
-        <w:color w:val="888888"/>
-        <w:sz w:val="16"/>
-        <w:szCs w:val="16"/>
-      </w:rPr>
-      <w:t xml:space="preserve">Richtlinie zur Geschäftsethik – Korruptionsbekämpfung und Geldwäscheprävention  ·  Seite </w:t>
-    </w:r>
-    <w:r>
-      <w:rPr>
-        <w:color w:val="888888"/>
-        <w:sz w:val="16"/>
-        <w:szCs w:val="16"/>
-      </w:rPr>
-      <w:fldChar w:fldCharType="begin"/>
-      <w:instrText xml:space="preserve">PAGE</w:instrText>
-      <w:fldChar w:fldCharType="separate"/>
-      <w:fldChar w:fldCharType="end"/>
-    </w:r>
-  </w:p>
-</w:ftr>
 </file>
 
 <file path=word/footnotes.xml><?xml version="1.0" encoding="utf-8"?>

</xml_diff>